<commit_message>
feat(129): rebrand ALCv → LexCV in active docs and commercial docs
CLAUDE.md, DEPLOYMENT.md, backend/migrations/README.md, .trae/documents/SPEC.md,
docs/MANUAL_DO_UTILIZADOR.{md,html,pptx} (+ generator scripts), and business/
documentation now refer to LexCV. Reserved production domain alcv.tech left
unchanged (explicit decision). Fixed stale admin@alcv.cv doc references to
match the real seeded admin@lexcv.cv.

Co-Authored-By: Claude Sonnet 5 <noreply@anthropic.com>
Claude-Session: https://claude.ai/code/session_01JJeJW3WQUa1GoEjVDcxtU7
</commit_message>
<xml_diff>
--- a/business/documentacao/registo-de-alteracoes.docx
+++ b/business/documentacao/registo-de-alteracoes.docx
@@ -4904,7 +4904,7 @@
         </w:tc>
         <w:tc>
           <w:tcPr>
-            <w:tcW w:type="dxa" w:w="2688"/>
+            <w:tcW w:type="dxa" w:w="2689"/>
             <w:shd w:val="clear" w:color="auto" w:fill="E8EEF6"/>
           </w:tcPr>
           <w:p>
@@ -4922,7 +4922,7 @@
         </w:tc>
         <w:tc>
           <w:tcPr>
-            <w:tcW w:type="dxa" w:w="1430"/>
+            <w:tcW w:type="dxa" w:w="1429"/>
             <w:shd w:val="clear" w:color="auto" w:fill="E8EEF6"/>
           </w:tcPr>
           <w:p>
@@ -4992,7 +4992,7 @@
         </w:tc>
         <w:tc>
           <w:tcPr>
-            <w:tcW w:type="dxa" w:w="2688"/>
+            <w:tcW w:type="dxa" w:w="2689"/>
           </w:tcPr>
           <w:p>
             <w:pPr>
@@ -5008,7 +5008,7 @@
         </w:tc>
         <w:tc>
           <w:tcPr>
-            <w:tcW w:type="dxa" w:w="1430"/>
+            <w:tcW w:type="dxa" w:w="1429"/>
           </w:tcPr>
           <w:p>
             <w:pPr>
@@ -5074,7 +5074,7 @@
         </w:tc>
         <w:tc>
           <w:tcPr>
-            <w:tcW w:type="dxa" w:w="2688"/>
+            <w:tcW w:type="dxa" w:w="2689"/>
           </w:tcPr>
           <w:p>
             <w:pPr>
@@ -5090,7 +5090,7 @@
         </w:tc>
         <w:tc>
           <w:tcPr>
-            <w:tcW w:type="dxa" w:w="1430"/>
+            <w:tcW w:type="dxa" w:w="1429"/>
           </w:tcPr>
           <w:p>
             <w:pPr>
@@ -5156,7 +5156,7 @@
         </w:tc>
         <w:tc>
           <w:tcPr>
-            <w:tcW w:type="dxa" w:w="2688"/>
+            <w:tcW w:type="dxa" w:w="2689"/>
           </w:tcPr>
           <w:p>
             <w:pPr>
@@ -5172,7 +5172,7 @@
         </w:tc>
         <w:tc>
           <w:tcPr>
-            <w:tcW w:type="dxa" w:w="1430"/>
+            <w:tcW w:type="dxa" w:w="1429"/>
           </w:tcPr>
           <w:p>
             <w:pPr>
@@ -5238,7 +5238,7 @@
         </w:tc>
         <w:tc>
           <w:tcPr>
-            <w:tcW w:type="dxa" w:w="2688"/>
+            <w:tcW w:type="dxa" w:w="2689"/>
           </w:tcPr>
           <w:p>
             <w:pPr>
@@ -5254,7 +5254,7 @@
         </w:tc>
         <w:tc>
           <w:tcPr>
-            <w:tcW w:type="dxa" w:w="1430"/>
+            <w:tcW w:type="dxa" w:w="1429"/>
           </w:tcPr>
           <w:p>
             <w:pPr>
@@ -5320,7 +5320,7 @@
         </w:tc>
         <w:tc>
           <w:tcPr>
-            <w:tcW w:type="dxa" w:w="2688"/>
+            <w:tcW w:type="dxa" w:w="2689"/>
           </w:tcPr>
           <w:p>
             <w:pPr>
@@ -5336,7 +5336,7 @@
         </w:tc>
         <w:tc>
           <w:tcPr>
-            <w:tcW w:type="dxa" w:w="1430"/>
+            <w:tcW w:type="dxa" w:w="1429"/>
           </w:tcPr>
           <w:p>
             <w:pPr>
@@ -5402,7 +5402,7 @@
         </w:tc>
         <w:tc>
           <w:tcPr>
-            <w:tcW w:type="dxa" w:w="2688"/>
+            <w:tcW w:type="dxa" w:w="2689"/>
           </w:tcPr>
           <w:p>
             <w:pPr>
@@ -5418,7 +5418,7 @@
         </w:tc>
         <w:tc>
           <w:tcPr>
-            <w:tcW w:type="dxa" w:w="1430"/>
+            <w:tcW w:type="dxa" w:w="1429"/>
           </w:tcPr>
           <w:p>
             <w:pPr>
@@ -5484,7 +5484,7 @@
         </w:tc>
         <w:tc>
           <w:tcPr>
-            <w:tcW w:type="dxa" w:w="2688"/>
+            <w:tcW w:type="dxa" w:w="2689"/>
           </w:tcPr>
           <w:p>
             <w:pPr>
@@ -5500,7 +5500,7 @@
         </w:tc>
         <w:tc>
           <w:tcPr>
-            <w:tcW w:type="dxa" w:w="1430"/>
+            <w:tcW w:type="dxa" w:w="1429"/>
           </w:tcPr>
           <w:p>
             <w:pPr>
@@ -5566,7 +5566,7 @@
         </w:tc>
         <w:tc>
           <w:tcPr>
-            <w:tcW w:type="dxa" w:w="2688"/>
+            <w:tcW w:type="dxa" w:w="2689"/>
           </w:tcPr>
           <w:p>
             <w:pPr>
@@ -5582,7 +5582,7 @@
         </w:tc>
         <w:tc>
           <w:tcPr>
-            <w:tcW w:type="dxa" w:w="1430"/>
+            <w:tcW w:type="dxa" w:w="1429"/>
           </w:tcPr>
           <w:p>
             <w:pPr>
@@ -5648,7 +5648,7 @@
         </w:tc>
         <w:tc>
           <w:tcPr>
-            <w:tcW w:type="dxa" w:w="2688"/>
+            <w:tcW w:type="dxa" w:w="2689"/>
           </w:tcPr>
           <w:p>
             <w:pPr>
@@ -5664,7 +5664,7 @@
         </w:tc>
         <w:tc>
           <w:tcPr>
-            <w:tcW w:type="dxa" w:w="1430"/>
+            <w:tcW w:type="dxa" w:w="1429"/>
           </w:tcPr>
           <w:p>
             <w:pPr>
@@ -5730,7 +5730,7 @@
         </w:tc>
         <w:tc>
           <w:tcPr>
-            <w:tcW w:type="dxa" w:w="2688"/>
+            <w:tcW w:type="dxa" w:w="2689"/>
           </w:tcPr>
           <w:p>
             <w:pPr>
@@ -5746,7 +5746,7 @@
         </w:tc>
         <w:tc>
           <w:tcPr>
-            <w:tcW w:type="dxa" w:w="1430"/>
+            <w:tcW w:type="dxa" w:w="1429"/>
           </w:tcPr>
           <w:p>
             <w:pPr>
@@ -5812,7 +5812,7 @@
         </w:tc>
         <w:tc>
           <w:tcPr>
-            <w:tcW w:type="dxa" w:w="2688"/>
+            <w:tcW w:type="dxa" w:w="2689"/>
           </w:tcPr>
           <w:p>
             <w:pPr>
@@ -5828,7 +5828,7 @@
         </w:tc>
         <w:tc>
           <w:tcPr>
-            <w:tcW w:type="dxa" w:w="1430"/>
+            <w:tcW w:type="dxa" w:w="1429"/>
           </w:tcPr>
           <w:p>
             <w:pPr>
@@ -5894,7 +5894,7 @@
         </w:tc>
         <w:tc>
           <w:tcPr>
-            <w:tcW w:type="dxa" w:w="2688"/>
+            <w:tcW w:type="dxa" w:w="2689"/>
           </w:tcPr>
           <w:p>
             <w:pPr>
@@ -5910,7 +5910,7 @@
         </w:tc>
         <w:tc>
           <w:tcPr>
-            <w:tcW w:type="dxa" w:w="1430"/>
+            <w:tcW w:type="dxa" w:w="1429"/>
           </w:tcPr>
           <w:p>
             <w:pPr>
@@ -5976,7 +5976,7 @@
         </w:tc>
         <w:tc>
           <w:tcPr>
-            <w:tcW w:type="dxa" w:w="2688"/>
+            <w:tcW w:type="dxa" w:w="2689"/>
           </w:tcPr>
           <w:p>
             <w:pPr>
@@ -5992,7 +5992,7 @@
         </w:tc>
         <w:tc>
           <w:tcPr>
-            <w:tcW w:type="dxa" w:w="1430"/>
+            <w:tcW w:type="dxa" w:w="1429"/>
           </w:tcPr>
           <w:p>
             <w:pPr>
@@ -6058,7 +6058,7 @@
         </w:tc>
         <w:tc>
           <w:tcPr>
-            <w:tcW w:type="dxa" w:w="2688"/>
+            <w:tcW w:type="dxa" w:w="2689"/>
           </w:tcPr>
           <w:p>
             <w:pPr>
@@ -6074,7 +6074,7 @@
         </w:tc>
         <w:tc>
           <w:tcPr>
-            <w:tcW w:type="dxa" w:w="1430"/>
+            <w:tcW w:type="dxa" w:w="1429"/>
           </w:tcPr>
           <w:p>
             <w:pPr>
@@ -6140,7 +6140,7 @@
         </w:tc>
         <w:tc>
           <w:tcPr>
-            <w:tcW w:type="dxa" w:w="2688"/>
+            <w:tcW w:type="dxa" w:w="2689"/>
           </w:tcPr>
           <w:p>
             <w:pPr>
@@ -6156,7 +6156,7 @@
         </w:tc>
         <w:tc>
           <w:tcPr>
-            <w:tcW w:type="dxa" w:w="1430"/>
+            <w:tcW w:type="dxa" w:w="1429"/>
           </w:tcPr>
           <w:p>
             <w:pPr>
@@ -6222,7 +6222,7 @@
         </w:tc>
         <w:tc>
           <w:tcPr>
-            <w:tcW w:type="dxa" w:w="2688"/>
+            <w:tcW w:type="dxa" w:w="2689"/>
           </w:tcPr>
           <w:p>
             <w:pPr>
@@ -6238,7 +6238,7 @@
         </w:tc>
         <w:tc>
           <w:tcPr>
-            <w:tcW w:type="dxa" w:w="1430"/>
+            <w:tcW w:type="dxa" w:w="1429"/>
           </w:tcPr>
           <w:p>
             <w:pPr>
@@ -6304,7 +6304,7 @@
         </w:tc>
         <w:tc>
           <w:tcPr>
-            <w:tcW w:type="dxa" w:w="2688"/>
+            <w:tcW w:type="dxa" w:w="2689"/>
           </w:tcPr>
           <w:p>
             <w:pPr>
@@ -6320,7 +6320,7 @@
         </w:tc>
         <w:tc>
           <w:tcPr>
-            <w:tcW w:type="dxa" w:w="1430"/>
+            <w:tcW w:type="dxa" w:w="1429"/>
           </w:tcPr>
           <w:p>
             <w:pPr>
@@ -6386,7 +6386,7 @@
         </w:tc>
         <w:tc>
           <w:tcPr>
-            <w:tcW w:type="dxa" w:w="2688"/>
+            <w:tcW w:type="dxa" w:w="2689"/>
           </w:tcPr>
           <w:p>
             <w:pPr>
@@ -6402,7 +6402,7 @@
         </w:tc>
         <w:tc>
           <w:tcPr>
-            <w:tcW w:type="dxa" w:w="1430"/>
+            <w:tcW w:type="dxa" w:w="1429"/>
           </w:tcPr>
           <w:p>
             <w:pPr>
@@ -6468,7 +6468,7 @@
         </w:tc>
         <w:tc>
           <w:tcPr>
-            <w:tcW w:type="dxa" w:w="2688"/>
+            <w:tcW w:type="dxa" w:w="2689"/>
           </w:tcPr>
           <w:p>
             <w:pPr>
@@ -6484,7 +6484,7 @@
         </w:tc>
         <w:tc>
           <w:tcPr>
-            <w:tcW w:type="dxa" w:w="1430"/>
+            <w:tcW w:type="dxa" w:w="1429"/>
           </w:tcPr>
           <w:p>
             <w:pPr>
@@ -6550,7 +6550,7 @@
         </w:tc>
         <w:tc>
           <w:tcPr>
-            <w:tcW w:type="dxa" w:w="2688"/>
+            <w:tcW w:type="dxa" w:w="2689"/>
           </w:tcPr>
           <w:p>
             <w:pPr>
@@ -6566,7 +6566,7 @@
         </w:tc>
         <w:tc>
           <w:tcPr>
-            <w:tcW w:type="dxa" w:w="1430"/>
+            <w:tcW w:type="dxa" w:w="1429"/>
           </w:tcPr>
           <w:p>
             <w:pPr>
@@ -6633,7 +6633,7 @@
         </w:tc>
         <w:tc>
           <w:tcPr>
-            <w:tcW w:type="dxa" w:w="2688"/>
+            <w:tcW w:type="dxa" w:w="2689"/>
           </w:tcPr>
           <w:p>
             <w:pPr>
@@ -6649,7 +6649,7 @@
         </w:tc>
         <w:tc>
           <w:tcPr>
-            <w:tcW w:type="dxa" w:w="1430"/>
+            <w:tcW w:type="dxa" w:w="1429"/>
           </w:tcPr>
           <w:p>
             <w:pPr>
@@ -6716,7 +6716,7 @@
         </w:tc>
         <w:tc>
           <w:tcPr>
-            <w:tcW w:type="dxa" w:w="2688"/>
+            <w:tcW w:type="dxa" w:w="2689"/>
           </w:tcPr>
           <w:p>
             <w:pPr>
@@ -6732,7 +6732,7 @@
         </w:tc>
         <w:tc>
           <w:tcPr>
-            <w:tcW w:type="dxa" w:w="1430"/>
+            <w:tcW w:type="dxa" w:w="1429"/>
           </w:tcPr>
           <w:p>
             <w:pPr>
@@ -6798,7 +6798,7 @@
         </w:tc>
         <w:tc>
           <w:tcPr>
-            <w:tcW w:type="dxa" w:w="2688"/>
+            <w:tcW w:type="dxa" w:w="2689"/>
           </w:tcPr>
           <w:p>
             <w:pPr>
@@ -6814,7 +6814,7 @@
         </w:tc>
         <w:tc>
           <w:tcPr>
-            <w:tcW w:type="dxa" w:w="1430"/>
+            <w:tcW w:type="dxa" w:w="1429"/>
           </w:tcPr>
           <w:p>
             <w:pPr>
@@ -6880,7 +6880,7 @@
         </w:tc>
         <w:tc>
           <w:tcPr>
-            <w:tcW w:type="dxa" w:w="2688"/>
+            <w:tcW w:type="dxa" w:w="2689"/>
           </w:tcPr>
           <w:p>
             <w:pPr>
@@ -6896,7 +6896,7 @@
         </w:tc>
         <w:tc>
           <w:tcPr>
-            <w:tcW w:type="dxa" w:w="1430"/>
+            <w:tcW w:type="dxa" w:w="1429"/>
           </w:tcPr>
           <w:p>
             <w:pPr>
@@ -6962,7 +6962,7 @@
         </w:tc>
         <w:tc>
           <w:tcPr>
-            <w:tcW w:type="dxa" w:w="2688"/>
+            <w:tcW w:type="dxa" w:w="2689"/>
           </w:tcPr>
           <w:p>
             <w:pPr>
@@ -6978,7 +6978,7 @@
         </w:tc>
         <w:tc>
           <w:tcPr>
-            <w:tcW w:type="dxa" w:w="1430"/>
+            <w:tcW w:type="dxa" w:w="1429"/>
           </w:tcPr>
           <w:p>
             <w:pPr>
@@ -7044,7 +7044,7 @@
         </w:tc>
         <w:tc>
           <w:tcPr>
-            <w:tcW w:type="dxa" w:w="2688"/>
+            <w:tcW w:type="dxa" w:w="2689"/>
           </w:tcPr>
           <w:p>
             <w:pPr>
@@ -7060,7 +7060,7 @@
         </w:tc>
         <w:tc>
           <w:tcPr>
-            <w:tcW w:type="dxa" w:w="1430"/>
+            <w:tcW w:type="dxa" w:w="1429"/>
           </w:tcPr>
           <w:p>
             <w:pPr>
@@ -7126,7 +7126,7 @@
         </w:tc>
         <w:tc>
           <w:tcPr>
-            <w:tcW w:type="dxa" w:w="2688"/>
+            <w:tcW w:type="dxa" w:w="2689"/>
           </w:tcPr>
           <w:p>
             <w:pPr>
@@ -7142,7 +7142,7 @@
         </w:tc>
         <w:tc>
           <w:tcPr>
-            <w:tcW w:type="dxa" w:w="1430"/>
+            <w:tcW w:type="dxa" w:w="1429"/>
           </w:tcPr>
           <w:p>
             <w:pPr>

</xml_diff>